<commit_message>
Update in doc based on Session 1
</commit_message>
<xml_diff>
--- a/docs/AWS Lambda function development.docx
+++ b/docs/AWS Lambda function development.docx
@@ -4,9 +4,12 @@
   <w:body>
     <w:p>
       <w:pPr>
+        <w:jc w:val="center"/>
         <w:rPr>
           <w:b/>
           <w:bCs/>
+          <w:sz w:val="44"/>
+          <w:szCs w:val="44"/>
           <w:lang w:val="en-US"/>
         </w:rPr>
       </w:pPr>
@@ -14,6 +17,8 @@
         <w:rPr>
           <w:b/>
           <w:bCs/>
+          <w:sz w:val="44"/>
+          <w:szCs w:val="44"/>
           <w:lang w:val="en-US"/>
         </w:rPr>
         <w:t>Creating AWS Lambda function</w:t>
@@ -22,55 +27,162 @@
         <w:rPr>
           <w:b/>
           <w:bCs/>
+          <w:sz w:val="44"/>
+          <w:szCs w:val="44"/>
           <w:lang w:val="en-US"/>
         </w:rPr>
         <w:t>s</w:t>
       </w:r>
-      <w:r>
+    </w:p>
+    <w:p>
+      <w:pPr>
         <w:rPr>
           <w:b/>
           <w:bCs/>
           <w:lang w:val="en-US"/>
         </w:rPr>
-        <w:t xml:space="preserve"> </w:t>
+      </w:pPr>
+      <w:r>
+        <w:rPr>
+          <w:b/>
+          <w:bCs/>
+          <w:lang w:val="en-US"/>
+        </w:rPr>
+        <w:t xml:space="preserve">Application Name: </w:t>
+      </w:r>
+      <w:r>
+        <w:rPr>
+          <w:lang w:val="en-US"/>
+        </w:rPr>
+        <w:t>Employee Management</w:t>
       </w:r>
     </w:p>
     <w:p>
       <w:pPr>
         <w:rPr>
+          <w:lang w:val="en-US"/>
+        </w:rPr>
+      </w:pPr>
+      <w:r>
+        <w:rPr>
           <w:b/>
           <w:bCs/>
           <w:lang w:val="en-US"/>
         </w:rPr>
-      </w:pPr>
-      <w:r>
+        <w:t>Project  type</w:t>
+      </w:r>
+      <w:r>
+        <w:rPr>
+          <w:lang w:val="en-US"/>
+        </w:rPr>
+        <w:t>: Class Library</w:t>
+      </w:r>
+    </w:p>
+    <w:p>
+      <w:pPr>
         <w:rPr>
           <w:b/>
           <w:bCs/>
           <w:lang w:val="en-US"/>
         </w:rPr>
-        <w:t>Application Name: Employee Management</w:t>
+      </w:pPr>
+      <w:r>
+        <w:rPr>
+          <w:b/>
+          <w:bCs/>
+          <w:lang w:val="en-US"/>
+        </w:rPr>
+        <w:t>AWS Services which are going to use:</w:t>
       </w:r>
     </w:p>
     <w:p>
       <w:pPr>
-        <w:rPr>
-          <w:lang w:val="en-US"/>
-        </w:rPr>
-      </w:pPr>
-      <w:r>
-        <w:rPr>
-          <w:b/>
-          <w:bCs/>
-          <w:lang w:val="en-US"/>
-        </w:rPr>
-        <w:t>Project  type</w:t>
-      </w:r>
-      <w:r>
-        <w:rPr>
-          <w:lang w:val="en-US"/>
-        </w:rPr>
-        <w:t>: Class Library</w:t>
+        <w:pStyle w:val="ListParagraph"/>
+        <w:numPr>
+          <w:ilvl w:val="0"/>
+          <w:numId w:val="4"/>
+        </w:numPr>
+        <w:rPr>
+          <w:lang w:val="en-US"/>
+        </w:rPr>
+      </w:pPr>
+      <w:r>
+        <w:rPr>
+          <w:lang w:val="en-US"/>
+        </w:rPr>
+        <w:t>API Management</w:t>
+      </w:r>
+    </w:p>
+    <w:p>
+      <w:pPr>
+        <w:pStyle w:val="ListParagraph"/>
+        <w:numPr>
+          <w:ilvl w:val="0"/>
+          <w:numId w:val="4"/>
+        </w:numPr>
+        <w:rPr>
+          <w:lang w:val="en-US"/>
+        </w:rPr>
+      </w:pPr>
+      <w:r>
+        <w:rPr>
+          <w:lang w:val="en-US"/>
+        </w:rPr>
+        <w:t>AWS Lambda functions</w:t>
+      </w:r>
+    </w:p>
+    <w:p>
+      <w:pPr>
+        <w:pStyle w:val="ListParagraph"/>
+        <w:numPr>
+          <w:ilvl w:val="0"/>
+          <w:numId w:val="4"/>
+        </w:numPr>
+        <w:rPr>
+          <w:lang w:val="en-US"/>
+        </w:rPr>
+      </w:pPr>
+      <w:r>
+        <w:rPr>
+          <w:lang w:val="en-US"/>
+        </w:rPr>
+        <w:t>Dynamo DB</w:t>
+      </w:r>
+    </w:p>
+    <w:p>
+      <w:pPr>
+        <w:pStyle w:val="ListParagraph"/>
+        <w:numPr>
+          <w:ilvl w:val="0"/>
+          <w:numId w:val="4"/>
+        </w:numPr>
+        <w:rPr>
+          <w:lang w:val="en-US"/>
+        </w:rPr>
+      </w:pPr>
+      <w:r>
+        <w:rPr>
+          <w:lang w:val="en-US"/>
+        </w:rPr>
+        <w:t>S3 bucket</w:t>
+      </w:r>
+    </w:p>
+    <w:p>
+      <w:pPr>
+        <w:pStyle w:val="ListParagraph"/>
+        <w:numPr>
+          <w:ilvl w:val="0"/>
+          <w:numId w:val="4"/>
+        </w:numPr>
+        <w:rPr>
+          <w:lang w:val="en-US"/>
+        </w:rPr>
+      </w:pPr>
+      <w:r>
+        <w:rPr>
+          <w:lang w:val="en-US"/>
+        </w:rPr>
+        <w:t>EC2 instance</w:t>
       </w:r>
     </w:p>
     <w:p>
@@ -468,7 +580,7 @@
               <v:shapetype w14:anchorId="6374D0CE" id="_x0000_t132" coordsize="21600,21600" o:spt="132" path="m10800,qx,3391l,18209qy10800,21600,21600,18209l21600,3391qy10800,xem,3391nfqy10800,6782,21600,3391e">
                 <v:path o:extrusionok="f" gradientshapeok="t" o:connecttype="custom" o:connectlocs="10800,6782;10800,0;0,10800;10800,21600;21600,10800" o:connectangles="270,270,180,90,0" textboxrect="0,6782,21600,18209"/>
               </v:shapetype>
-              <v:shape id="Flowchart: Magnetic Disk 3" o:spid="_x0000_s1026" type="#_x0000_t132" style="position:absolute;margin-left:20.8pt;margin-top:12.1pt;width:1in;height:75.5pt;z-index:251666432;visibility:visible;mso-wrap-style:square;mso-height-percent:0;mso-wrap-distance-left:9pt;mso-wrap-distance-top:0;mso-wrap-distance-right:9pt;mso-wrap-distance-bottom:0;mso-position-horizontal:right;mso-position-horizontal-relative:margin;mso-position-vertical:absolute;mso-position-vertical-relative:text;mso-height-percent:0;mso-height-relative:margin;v-text-anchor:middle" o:gfxdata="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" fillcolor="#f1a983 [1941]" strokecolor="#030e13 [484]" strokeweight="1.5pt">
+              <v:shape id="Flowchart: Magnetic Disk 3" o:spid="_x0000_s1026" type="#_x0000_t132" style="position:absolute;margin-left:20.8pt;margin-top:12.1pt;width:1in;height:75.5pt;z-index:251666432;visibility:visible;mso-wrap-style:square;mso-height-percent:0;mso-wrap-distance-left:9pt;mso-wrap-distance-top:0;mso-wrap-distance-right:9pt;mso-wrap-distance-bottom:0;mso-position-horizontal:right;mso-position-horizontal-relative:margin;mso-position-vertical:absolute;mso-position-vertical-relative:text;mso-height-percent:0;mso-height-relative:margin;v-text-anchor:middle" o:gfxdata="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" fillcolor="#f1a983 [1941]" strokecolor="#030e13 [484]" strokeweight="1.5pt">
                 <v:stroke joinstyle="miter"/>
                 <v:textbox>
                   <w:txbxContent>
@@ -580,7 +692,7 @@
         <mc:AlternateContent>
           <mc:Choice Requires="wps">
             <w:drawing>
-              <wp:anchor distT="0" distB="0" distL="114300" distR="114300" simplePos="0" relativeHeight="251667456" behindDoc="0" locked="0" layoutInCell="1" allowOverlap="1" wp14:anchorId="6CEE9863" wp14:editId="3C372E57">
+              <wp:anchor distT="0" distB="0" distL="114300" distR="114300" simplePos="0" relativeHeight="251667456" behindDoc="0" locked="0" layoutInCell="1" allowOverlap="1" wp14:anchorId="6CEE9863" wp14:editId="3D93AF62">
                 <wp:simplePos x="0" y="0"/>
                 <wp:positionH relativeFrom="margin">
                   <wp:posOffset>4925378</wp:posOffset>
@@ -670,7 +782,7 @@
                 <v:stroke joinstyle="miter"/>
                 <v:path o:extrusionok="f" o:connecttype="custom" o:connectlocs="10800,0;0,10800;10800,19890;21600,10800" textboxrect="0,3675,18595,18022"/>
               </v:shapetype>
-              <v:shape id="Flowchart: Multidocument 4" o:spid="_x0000_s1027" type="#_x0000_t115" style="position:absolute;margin-left:387.85pt;margin-top:124.1pt;width:53.55pt;height:66.5pt;z-index:251667456;visibility:visible;mso-wrap-style:square;mso-width-percent:0;mso-height-percent:0;mso-wrap-distance-left:9pt;mso-wrap-distance-top:0;mso-wrap-distance-right:9pt;mso-wrap-distance-bottom:0;mso-position-horizontal:absolute;mso-position-horizontal-relative:margin;mso-position-vertical:absolute;mso-position-vertical-relative:text;mso-width-percent:0;mso-height-percent:0;mso-width-relative:margin;mso-height-relative:margin;v-text-anchor:middle" o:gfxdata="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" fillcolor="#f1a983 [1941]" strokecolor="#030e13 [484]" strokeweight="1.5pt">
+              <v:shape id="Flowchart: Multidocument 4" o:spid="_x0000_s1027" type="#_x0000_t115" style="position:absolute;margin-left:387.85pt;margin-top:124.1pt;width:53.55pt;height:66.5pt;z-index:251667456;visibility:visible;mso-wrap-style:square;mso-width-percent:0;mso-height-percent:0;mso-wrap-distance-left:9pt;mso-wrap-distance-top:0;mso-wrap-distance-right:9pt;mso-wrap-distance-bottom:0;mso-position-horizontal:absolute;mso-position-horizontal-relative:margin;mso-position-vertical:absolute;mso-position-vertical-relative:text;mso-width-percent:0;mso-height-percent:0;mso-width-relative:margin;mso-height-relative:margin;v-text-anchor:middle" o:gfxdata="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" fillcolor="#f1a983 [1941]" strokecolor="#030e13 [484]" strokeweight="1.5pt">
                 <v:textbox>
                   <w:txbxContent>
                     <w:p>
@@ -705,7 +817,7 @@
         <mc:AlternateContent>
           <mc:Choice Requires="wps">
             <w:drawing>
-              <wp:anchor distT="0" distB="0" distL="114300" distR="114300" simplePos="0" relativeHeight="251671552" behindDoc="0" locked="0" layoutInCell="1" allowOverlap="1" wp14:anchorId="55ADA339" wp14:editId="340D404A">
+              <wp:anchor distT="0" distB="0" distL="114300" distR="114300" simplePos="0" relativeHeight="251671552" behindDoc="0" locked="0" layoutInCell="1" allowOverlap="1" wp14:anchorId="55ADA339" wp14:editId="4DA9C308">
                 <wp:simplePos x="0" y="0"/>
                 <wp:positionH relativeFrom="column">
                   <wp:posOffset>2216150</wp:posOffset>
@@ -753,6 +865,12 @@
                     </wps:wsp>
                   </a:graphicData>
                 </a:graphic>
+                <wp14:sizeRelH relativeFrom="margin">
+                  <wp14:pctWidth>0</wp14:pctWidth>
+                </wp14:sizeRelH>
+                <wp14:sizeRelV relativeFrom="margin">
+                  <wp14:pctHeight>0</wp14:pctHeight>
+                </wp14:sizeRelV>
               </wp:anchor>
             </w:drawing>
           </mc:Choice>
@@ -775,7 +893,7 @@
         <mc:AlternateContent>
           <mc:Choice Requires="wps">
             <w:drawing>
-              <wp:anchor distT="0" distB="0" distL="114300" distR="114300" simplePos="0" relativeHeight="251669504" behindDoc="0" locked="0" layoutInCell="1" allowOverlap="1" wp14:anchorId="0F72265E" wp14:editId="52F26024">
+              <wp:anchor distT="0" distB="0" distL="114300" distR="114300" simplePos="0" relativeHeight="251669504" behindDoc="0" locked="0" layoutInCell="1" allowOverlap="1" wp14:anchorId="0F72265E" wp14:editId="1BBA95F9">
                 <wp:simplePos x="0" y="0"/>
                 <wp:positionH relativeFrom="column">
                   <wp:posOffset>2203450</wp:posOffset>
@@ -823,6 +941,12 @@
                     </wps:wsp>
                   </a:graphicData>
                 </a:graphic>
+                <wp14:sizeRelH relativeFrom="margin">
+                  <wp14:pctWidth>0</wp14:pctWidth>
+                </wp14:sizeRelH>
+                <wp14:sizeRelV relativeFrom="margin">
+                  <wp14:pctHeight>0</wp14:pctHeight>
+                </wp14:sizeRelV>
               </wp:anchor>
             </w:drawing>
           </mc:Choice>
@@ -845,7 +969,7 @@
         <mc:AlternateContent>
           <mc:Choice Requires="wps">
             <w:drawing>
-              <wp:anchor distT="0" distB="0" distL="114300" distR="114300" simplePos="0" relativeHeight="251668480" behindDoc="0" locked="0" layoutInCell="1" allowOverlap="1" wp14:anchorId="202D3EFD" wp14:editId="7099CEBA">
+              <wp:anchor distT="0" distB="0" distL="114300" distR="114300" simplePos="0" relativeHeight="251668480" behindDoc="0" locked="0" layoutInCell="1" allowOverlap="1" wp14:anchorId="202D3EFD" wp14:editId="41DD115C">
                 <wp:simplePos x="0" y="0"/>
                 <wp:positionH relativeFrom="column">
                   <wp:posOffset>3378200</wp:posOffset>
@@ -898,6 +1022,12 @@
                     </wps:wsp>
                   </a:graphicData>
                 </a:graphic>
+                <wp14:sizeRelH relativeFrom="margin">
+                  <wp14:pctWidth>0</wp14:pctWidth>
+                </wp14:sizeRelH>
+                <wp14:sizeRelV relativeFrom="margin">
+                  <wp14:pctHeight>0</wp14:pctHeight>
+                </wp14:sizeRelV>
               </wp:anchor>
             </w:drawing>
           </mc:Choice>
@@ -920,7 +1050,7 @@
         <mc:AlternateContent>
           <mc:Choice Requires="wps">
             <w:drawing>
-              <wp:anchor distT="0" distB="0" distL="114300" distR="114300" simplePos="0" relativeHeight="251665408" behindDoc="0" locked="0" layoutInCell="1" allowOverlap="1" wp14:anchorId="77E28F84" wp14:editId="17159D60">
+              <wp:anchor distT="0" distB="0" distL="114300" distR="114300" simplePos="0" relativeHeight="251665408" behindDoc="0" locked="0" layoutInCell="1" allowOverlap="1" wp14:anchorId="77E28F84" wp14:editId="6D36D621">
                 <wp:simplePos x="0" y="0"/>
                 <wp:positionH relativeFrom="column">
                   <wp:posOffset>2794000</wp:posOffset>
@@ -1004,7 +1134,7 @@
           </mc:Choice>
           <mc:Fallback>
             <w:pict>
-              <v:rect w14:anchorId="77E28F84" id="Rectangle 2" o:spid="_x0000_s1028" style="position:absolute;margin-left:220pt;margin-top:143.5pt;width:92pt;height:40pt;z-index:251665408;visibility:visible;mso-wrap-style:square;mso-width-percent:0;mso-height-percent:0;mso-wrap-distance-left:9pt;mso-wrap-distance-top:0;mso-wrap-distance-right:9pt;mso-wrap-distance-bottom:0;mso-position-horizontal:absolute;mso-position-horizontal-relative:text;mso-position-vertical:absolute;mso-position-vertical-relative:text;mso-width-percent:0;mso-height-percent:0;mso-width-relative:margin;mso-height-relative:margin;v-text-anchor:middle" o:gfxdata="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" fillcolor="#10aae5 [3031]" stroked="f">
+              <v:rect w14:anchorId="77E28F84" id="Rectangle 2" o:spid="_x0000_s1028" style="position:absolute;margin-left:220pt;margin-top:143.5pt;width:92pt;height:40pt;z-index:251665408;visibility:visible;mso-wrap-style:square;mso-width-percent:0;mso-height-percent:0;mso-wrap-distance-left:9pt;mso-wrap-distance-top:0;mso-wrap-distance-right:9pt;mso-wrap-distance-bottom:0;mso-position-horizontal:absolute;mso-position-horizontal-relative:text;mso-position-vertical:absolute;mso-position-vertical-relative:text;mso-width-percent:0;mso-height-percent:0;mso-width-relative:margin;mso-height-relative:margin;v-text-anchor:middle" o:gfxdata="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" fillcolor="#10aae5 [3031]" stroked="f">
                 <v:fill color2="#0f9bd2 [3175]" rotate="t" colors="0 #47aadf;.5 #05a2df;1 #0094ce" focus="100%" type="gradient">
                   <o:fill v:ext="view" type="gradientUnscaled"/>
                 </v:fill>
@@ -1143,7 +1273,7 @@
           </mc:Choice>
           <mc:Fallback>
             <w:pict>
-              <v:rect w14:anchorId="430FBB4A" id="_x0000_s1029" style="position:absolute;margin-left:91.5pt;margin-top:33.1pt;width:22pt;height:154pt;z-index:251659264;visibility:visible;mso-wrap-style:square;mso-width-percent:0;mso-height-percent:0;mso-wrap-distance-left:9pt;mso-wrap-distance-top:0;mso-wrap-distance-right:9pt;mso-wrap-distance-bottom:0;mso-position-horizontal:absolute;mso-position-horizontal-relative:text;mso-position-vertical:absolute;mso-position-vertical-relative:text;mso-width-percent:0;mso-height-percent:0;mso-width-relative:margin;mso-height-relative:margin;v-text-anchor:middle" o:gfxdata="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" fillcolor="#156082 [3204]" strokecolor="#030e13 [484]" strokeweight="1.5pt">
+              <v:rect w14:anchorId="430FBB4A" id="_x0000_s1029" style="position:absolute;margin-left:91.5pt;margin-top:33.1pt;width:22pt;height:154pt;z-index:251659264;visibility:visible;mso-wrap-style:square;mso-width-percent:0;mso-height-percent:0;mso-wrap-distance-left:9pt;mso-wrap-distance-top:0;mso-wrap-distance-right:9pt;mso-wrap-distance-bottom:0;mso-position-horizontal:absolute;mso-position-horizontal-relative:text;mso-position-vertical:absolute;mso-position-vertical-relative:text;mso-width-percent:0;mso-height-percent:0;mso-width-relative:margin;mso-height-relative:margin;v-text-anchor:middle" o:gfxdata="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" fillcolor="#156082 [3204]" strokecolor="#030e13 [484]" strokeweight="1.5pt">
                 <v:textbox>
                   <w:txbxContent>
                     <w:p>
@@ -1192,7 +1322,7 @@
         <mc:AlternateContent>
           <mc:Choice Requires="wps">
             <w:drawing>
-              <wp:anchor distT="0" distB="0" distL="114300" distR="114300" simplePos="0" relativeHeight="251661312" behindDoc="0" locked="0" layoutInCell="1" allowOverlap="1" wp14:anchorId="3C52E9FE" wp14:editId="159CA03F">
+              <wp:anchor distT="0" distB="0" distL="114300" distR="114300" simplePos="0" relativeHeight="251661312" behindDoc="0" locked="0" layoutInCell="1" allowOverlap="1" wp14:anchorId="3C52E9FE" wp14:editId="545B6FEE">
                 <wp:simplePos x="0" y="0"/>
                 <wp:positionH relativeFrom="column">
                   <wp:posOffset>1911350</wp:posOffset>
@@ -1292,7 +1422,7 @@
           </mc:Choice>
           <mc:Fallback>
             <w:pict>
-              <v:rect w14:anchorId="3C52E9FE" id="_x0000_s1030" style="position:absolute;margin-left:150.5pt;margin-top:32.5pt;width:22pt;height:154pt;z-index:251661312;visibility:visible;mso-wrap-style:square;mso-width-percent:0;mso-height-percent:0;mso-wrap-distance-left:9pt;mso-wrap-distance-top:0;mso-wrap-distance-right:9pt;mso-wrap-distance-bottom:0;mso-position-horizontal:absolute;mso-position-horizontal-relative:text;mso-position-vertical:absolute;mso-position-vertical-relative:text;mso-width-percent:0;mso-height-percent:0;mso-width-relative:margin;mso-height-relative:margin;v-text-anchor:middle" o:gfxdata="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" fillcolor="#156082 [3204]" strokecolor="#030e13 [484]" strokeweight="1.5pt">
+              <v:rect w14:anchorId="3C52E9FE" id="_x0000_s1030" style="position:absolute;margin-left:150.5pt;margin-top:32.5pt;width:22pt;height:154pt;z-index:251661312;visibility:visible;mso-wrap-style:square;mso-width-percent:0;mso-height-percent:0;mso-wrap-distance-left:9pt;mso-wrap-distance-top:0;mso-wrap-distance-right:9pt;mso-wrap-distance-bottom:0;mso-position-horizontal:absolute;mso-position-horizontal-relative:text;mso-position-vertical:absolute;mso-position-vertical-relative:text;mso-width-percent:0;mso-height-percent:0;mso-width-relative:margin;mso-height-relative:margin;v-text-anchor:middle" o:gfxdata="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" fillcolor="#156082 [3204]" strokecolor="#030e13 [484]" strokeweight="1.5pt">
                 <v:textbox>
                   <w:txbxContent>
                     <w:p>
@@ -1347,7 +1477,7 @@
         <mc:AlternateContent>
           <mc:Choice Requires="wps">
             <w:drawing>
-              <wp:anchor distT="0" distB="0" distL="114300" distR="114300" simplePos="0" relativeHeight="251663360" behindDoc="0" locked="0" layoutInCell="1" allowOverlap="1" wp14:anchorId="78030C0B" wp14:editId="646FE676">
+              <wp:anchor distT="0" distB="0" distL="114300" distR="114300" simplePos="0" relativeHeight="251663360" behindDoc="0" locked="0" layoutInCell="1" allowOverlap="1" wp14:anchorId="78030C0B" wp14:editId="6EAB9B48">
                 <wp:simplePos x="0" y="0"/>
                 <wp:positionH relativeFrom="column">
                   <wp:posOffset>2768600</wp:posOffset>
@@ -1425,7 +1555,7 @@
           </mc:Choice>
           <mc:Fallback>
             <w:pict>
-              <v:rect w14:anchorId="78030C0B" id="_x0000_s1031" style="position:absolute;margin-left:218pt;margin-top:31.8pt;width:92pt;height:40pt;z-index:251663360;visibility:visible;mso-wrap-style:square;mso-width-percent:0;mso-height-percent:0;mso-wrap-distance-left:9pt;mso-wrap-distance-top:0;mso-wrap-distance-right:9pt;mso-wrap-distance-bottom:0;mso-position-horizontal:absolute;mso-position-horizontal-relative:text;mso-position-vertical:absolute;mso-position-vertical-relative:text;mso-width-percent:0;mso-height-percent:0;mso-width-relative:margin;mso-height-relative:margin;v-text-anchor:middle" o:gfxdata="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" fillcolor="#10aae5 [3031]" stroked="f">
+              <v:rect w14:anchorId="78030C0B" id="_x0000_s1031" style="position:absolute;margin-left:218pt;margin-top:31.8pt;width:92pt;height:40pt;z-index:251663360;visibility:visible;mso-wrap-style:square;mso-width-percent:0;mso-height-percent:0;mso-wrap-distance-left:9pt;mso-wrap-distance-top:0;mso-wrap-distance-right:9pt;mso-wrap-distance-bottom:0;mso-position-horizontal:absolute;mso-position-horizontal-relative:text;mso-position-vertical:absolute;mso-position-vertical-relative:text;mso-width-percent:0;mso-height-percent:0;mso-width-relative:margin;mso-height-relative:margin;v-text-anchor:middle" o:gfxdata="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" fillcolor="#10aae5 [3031]" stroked="f">
                 <v:fill color2="#0f9bd2 [3175]" rotate="t" colors="0 #47aadf;.5 #05a2df;1 #0094ce" focus="100%" type="gradient">
                   <o:fill v:ext="view" type="gradientUnscaled"/>
                 </v:fill>
@@ -1486,6 +1616,40 @@
     <w:p>
       <w:pPr>
         <w:rPr>
+          <w:b/>
+          <w:bCs/>
+          <w:lang w:val="en-US"/>
+        </w:rPr>
+      </w:pPr>
+      <w:r>
+        <w:rPr>
+          <w:b/>
+          <w:bCs/>
+          <w:lang w:val="en-US"/>
+        </w:rPr>
+        <w:t>AWS API Management</w:t>
+      </w:r>
+    </w:p>
+    <w:p>
+      <w:pPr>
+        <w:rPr>
+          <w:b/>
+          <w:bCs/>
+          <w:lang w:val="en-US"/>
+        </w:rPr>
+      </w:pPr>
+      <w:r>
+        <w:rPr>
+          <w:b/>
+          <w:bCs/>
+          <w:lang w:val="en-US"/>
+        </w:rPr>
+        <w:t>AWS Lamda Function:</w:t>
+      </w:r>
+    </w:p>
+    <w:p>
+      <w:pPr>
+        <w:rPr>
           <w:lang w:val="en-US"/>
         </w:rPr>
       </w:pPr>
@@ -1810,6 +1974,7 @@
         <w:rPr>
           <w:lang w:val="en-US"/>
         </w:rPr>
+        <w:lastRenderedPageBreak/>
         <w:t>Installing Lambda tools</w:t>
       </w:r>
     </w:p>
@@ -2080,7 +2245,6 @@
                 <w:lang w:eastAsia="en-GB"/>
                 <w14:ligatures w14:val="none"/>
               </w:rPr>
-              <w:lastRenderedPageBreak/>
               <w:t>dotnet</w:t>
             </w:r>
             <w:r>
@@ -2461,6 +2625,55 @@
         <w:rPr>
           <w:lang w:val="en-US"/>
         </w:rPr>
+        <w:t>Question on AWS lambda Functions</w:t>
+      </w:r>
+    </w:p>
+    <w:p>
+      <w:pPr>
+        <w:pStyle w:val="ListParagraph"/>
+        <w:numPr>
+          <w:ilvl w:val="0"/>
+          <w:numId w:val="5"/>
+        </w:numPr>
+        <w:rPr>
+          <w:lang w:val="en-US"/>
+        </w:rPr>
+      </w:pPr>
+      <w:r>
+        <w:rPr>
+          <w:lang w:val="en-US"/>
+        </w:rPr>
+        <w:t>How to maintain versioning of lambda functions both AWS side and .net Side?</w:t>
+      </w:r>
+    </w:p>
+    <w:p>
+      <w:pPr>
+        <w:pStyle w:val="ListParagraph"/>
+        <w:numPr>
+          <w:ilvl w:val="0"/>
+          <w:numId w:val="5"/>
+        </w:numPr>
+        <w:rPr>
+          <w:lang w:val="en-US"/>
+        </w:rPr>
+      </w:pPr>
+      <w:r>
+        <w:rPr>
+          <w:lang w:val="en-US"/>
+        </w:rPr>
+        <w:t>What would be the request object if API Gateway is not there?</w:t>
+      </w:r>
+    </w:p>
+    <w:p>
+      <w:pPr>
+        <w:rPr>
+          <w:lang w:val="en-US"/>
+        </w:rPr>
+      </w:pPr>
+      <w:r>
+        <w:rPr>
+          <w:lang w:val="en-US"/>
+        </w:rPr>
         <w:t>How to create or update existing AWS lambda to deploy the function.</w:t>
       </w:r>
     </w:p>
@@ -2586,6 +2799,119 @@
     </w:lvl>
   </w:abstractNum>
   <w:abstractNum w:abstractNumId="1" w15:restartNumberingAfterBreak="0">
+    <w:nsid w:val="36982E43"/>
+    <w:multiLevelType w:val="hybridMultilevel"/>
+    <w:tmpl w:val="1980B4EA"/>
+    <w:lvl w:ilvl="0" w:tplc="08090001">
+      <w:start w:val="1"/>
+      <w:numFmt w:val="bullet"/>
+      <w:lvlText w:val=""/>
+      <w:lvlJc w:val="left"/>
+      <w:pPr>
+        <w:ind w:left="720" w:hanging="360"/>
+      </w:pPr>
+      <w:rPr>
+        <w:rFonts w:ascii="Symbol" w:hAnsi="Symbol" w:hint="default"/>
+      </w:rPr>
+    </w:lvl>
+    <w:lvl w:ilvl="1" w:tplc="08090003" w:tentative="1">
+      <w:start w:val="1"/>
+      <w:numFmt w:val="bullet"/>
+      <w:lvlText w:val="o"/>
+      <w:lvlJc w:val="left"/>
+      <w:pPr>
+        <w:ind w:left="1440" w:hanging="360"/>
+      </w:pPr>
+      <w:rPr>
+        <w:rFonts w:ascii="Courier New" w:hAnsi="Courier New" w:cs="Courier New" w:hint="default"/>
+      </w:rPr>
+    </w:lvl>
+    <w:lvl w:ilvl="2" w:tplc="08090005" w:tentative="1">
+      <w:start w:val="1"/>
+      <w:numFmt w:val="bullet"/>
+      <w:lvlText w:val=""/>
+      <w:lvlJc w:val="left"/>
+      <w:pPr>
+        <w:ind w:left="2160" w:hanging="360"/>
+      </w:pPr>
+      <w:rPr>
+        <w:rFonts w:ascii="Wingdings" w:hAnsi="Wingdings" w:hint="default"/>
+      </w:rPr>
+    </w:lvl>
+    <w:lvl w:ilvl="3" w:tplc="08090001" w:tentative="1">
+      <w:start w:val="1"/>
+      <w:numFmt w:val="bullet"/>
+      <w:lvlText w:val=""/>
+      <w:lvlJc w:val="left"/>
+      <w:pPr>
+        <w:ind w:left="2880" w:hanging="360"/>
+      </w:pPr>
+      <w:rPr>
+        <w:rFonts w:ascii="Symbol" w:hAnsi="Symbol" w:hint="default"/>
+      </w:rPr>
+    </w:lvl>
+    <w:lvl w:ilvl="4" w:tplc="08090003" w:tentative="1">
+      <w:start w:val="1"/>
+      <w:numFmt w:val="bullet"/>
+      <w:lvlText w:val="o"/>
+      <w:lvlJc w:val="left"/>
+      <w:pPr>
+        <w:ind w:left="3600" w:hanging="360"/>
+      </w:pPr>
+      <w:rPr>
+        <w:rFonts w:ascii="Courier New" w:hAnsi="Courier New" w:cs="Courier New" w:hint="default"/>
+      </w:rPr>
+    </w:lvl>
+    <w:lvl w:ilvl="5" w:tplc="08090005" w:tentative="1">
+      <w:start w:val="1"/>
+      <w:numFmt w:val="bullet"/>
+      <w:lvlText w:val=""/>
+      <w:lvlJc w:val="left"/>
+      <w:pPr>
+        <w:ind w:left="4320" w:hanging="360"/>
+      </w:pPr>
+      <w:rPr>
+        <w:rFonts w:ascii="Wingdings" w:hAnsi="Wingdings" w:hint="default"/>
+      </w:rPr>
+    </w:lvl>
+    <w:lvl w:ilvl="6" w:tplc="08090001" w:tentative="1">
+      <w:start w:val="1"/>
+      <w:numFmt w:val="bullet"/>
+      <w:lvlText w:val=""/>
+      <w:lvlJc w:val="left"/>
+      <w:pPr>
+        <w:ind w:left="5040" w:hanging="360"/>
+      </w:pPr>
+      <w:rPr>
+        <w:rFonts w:ascii="Symbol" w:hAnsi="Symbol" w:hint="default"/>
+      </w:rPr>
+    </w:lvl>
+    <w:lvl w:ilvl="7" w:tplc="08090003" w:tentative="1">
+      <w:start w:val="1"/>
+      <w:numFmt w:val="bullet"/>
+      <w:lvlText w:val="o"/>
+      <w:lvlJc w:val="left"/>
+      <w:pPr>
+        <w:ind w:left="5760" w:hanging="360"/>
+      </w:pPr>
+      <w:rPr>
+        <w:rFonts w:ascii="Courier New" w:hAnsi="Courier New" w:cs="Courier New" w:hint="default"/>
+      </w:rPr>
+    </w:lvl>
+    <w:lvl w:ilvl="8" w:tplc="08090005" w:tentative="1">
+      <w:start w:val="1"/>
+      <w:numFmt w:val="bullet"/>
+      <w:lvlText w:val=""/>
+      <w:lvlJc w:val="left"/>
+      <w:pPr>
+        <w:ind w:left="6480" w:hanging="360"/>
+      </w:pPr>
+      <w:rPr>
+        <w:rFonts w:ascii="Wingdings" w:hAnsi="Wingdings" w:hint="default"/>
+      </w:rPr>
+    </w:lvl>
+  </w:abstractNum>
+  <w:abstractNum w:abstractNumId="2" w15:restartNumberingAfterBreak="0">
     <w:nsid w:val="576B718A"/>
     <w:multiLevelType w:val="hybridMultilevel"/>
     <w:tmpl w:val="110A0012"/>
@@ -2674,7 +3000,7 @@
       </w:pPr>
     </w:lvl>
   </w:abstractNum>
-  <w:abstractNum w:abstractNumId="2" w15:restartNumberingAfterBreak="0">
+  <w:abstractNum w:abstractNumId="3" w15:restartNumberingAfterBreak="0">
     <w:nsid w:val="58DA5C89"/>
     <w:multiLevelType w:val="hybridMultilevel"/>
     <w:tmpl w:val="6B3C5F96"/>
@@ -2760,13 +3086,108 @@
       </w:pPr>
     </w:lvl>
   </w:abstractNum>
+  <w:abstractNum w:abstractNumId="4" w15:restartNumberingAfterBreak="0">
+    <w:nsid w:val="5B0D4E6D"/>
+    <w:multiLevelType w:val="hybridMultilevel"/>
+    <w:tmpl w:val="680E6572"/>
+    <w:lvl w:ilvl="0" w:tplc="0809000F">
+      <w:start w:val="1"/>
+      <w:numFmt w:val="decimal"/>
+      <w:lvlText w:val="%1."/>
+      <w:lvlJc w:val="left"/>
+      <w:pPr>
+        <w:ind w:left="720" w:hanging="360"/>
+      </w:pPr>
+      <w:rPr>
+        <w:rFonts w:hint="default"/>
+      </w:rPr>
+    </w:lvl>
+    <w:lvl w:ilvl="1" w:tplc="08090019" w:tentative="1">
+      <w:start w:val="1"/>
+      <w:numFmt w:val="lowerLetter"/>
+      <w:lvlText w:val="%2."/>
+      <w:lvlJc w:val="left"/>
+      <w:pPr>
+        <w:ind w:left="1440" w:hanging="360"/>
+      </w:pPr>
+    </w:lvl>
+    <w:lvl w:ilvl="2" w:tplc="0809001B" w:tentative="1">
+      <w:start w:val="1"/>
+      <w:numFmt w:val="lowerRoman"/>
+      <w:lvlText w:val="%3."/>
+      <w:lvlJc w:val="right"/>
+      <w:pPr>
+        <w:ind w:left="2160" w:hanging="180"/>
+      </w:pPr>
+    </w:lvl>
+    <w:lvl w:ilvl="3" w:tplc="0809000F" w:tentative="1">
+      <w:start w:val="1"/>
+      <w:numFmt w:val="decimal"/>
+      <w:lvlText w:val="%4."/>
+      <w:lvlJc w:val="left"/>
+      <w:pPr>
+        <w:ind w:left="2880" w:hanging="360"/>
+      </w:pPr>
+    </w:lvl>
+    <w:lvl w:ilvl="4" w:tplc="08090019" w:tentative="1">
+      <w:start w:val="1"/>
+      <w:numFmt w:val="lowerLetter"/>
+      <w:lvlText w:val="%5."/>
+      <w:lvlJc w:val="left"/>
+      <w:pPr>
+        <w:ind w:left="3600" w:hanging="360"/>
+      </w:pPr>
+    </w:lvl>
+    <w:lvl w:ilvl="5" w:tplc="0809001B" w:tentative="1">
+      <w:start w:val="1"/>
+      <w:numFmt w:val="lowerRoman"/>
+      <w:lvlText w:val="%6."/>
+      <w:lvlJc w:val="right"/>
+      <w:pPr>
+        <w:ind w:left="4320" w:hanging="180"/>
+      </w:pPr>
+    </w:lvl>
+    <w:lvl w:ilvl="6" w:tplc="0809000F" w:tentative="1">
+      <w:start w:val="1"/>
+      <w:numFmt w:val="decimal"/>
+      <w:lvlText w:val="%7."/>
+      <w:lvlJc w:val="left"/>
+      <w:pPr>
+        <w:ind w:left="5040" w:hanging="360"/>
+      </w:pPr>
+    </w:lvl>
+    <w:lvl w:ilvl="7" w:tplc="08090019" w:tentative="1">
+      <w:start w:val="1"/>
+      <w:numFmt w:val="lowerLetter"/>
+      <w:lvlText w:val="%8."/>
+      <w:lvlJc w:val="left"/>
+      <w:pPr>
+        <w:ind w:left="5760" w:hanging="360"/>
+      </w:pPr>
+    </w:lvl>
+    <w:lvl w:ilvl="8" w:tplc="0809001B" w:tentative="1">
+      <w:start w:val="1"/>
+      <w:numFmt w:val="lowerRoman"/>
+      <w:lvlText w:val="%9."/>
+      <w:lvlJc w:val="right"/>
+      <w:pPr>
+        <w:ind w:left="6480" w:hanging="180"/>
+      </w:pPr>
+    </w:lvl>
+  </w:abstractNum>
   <w:num w:numId="1" w16cid:durableId="608320604">
-    <w:abstractNumId w:val="2"/>
+    <w:abstractNumId w:val="3"/>
   </w:num>
   <w:num w:numId="2" w16cid:durableId="1009603228">
     <w:abstractNumId w:val="0"/>
   </w:num>
   <w:num w:numId="3" w16cid:durableId="1169364085">
+    <w:abstractNumId w:val="2"/>
+  </w:num>
+  <w:num w:numId="4" w16cid:durableId="204106039">
+    <w:abstractNumId w:val="4"/>
+  </w:num>
+  <w:num w:numId="5" w16cid:durableId="1051924078">
     <w:abstractNumId w:val="1"/>
   </w:num>
 </w:numbering>
@@ -3375,6 +3796,7 @@
   <w:style w:type="character" w:default="1" w:styleId="DefaultParagraphFont">
     <w:name w:val="Default Paragraph Font"/>
     <w:uiPriority w:val="1"/>
+    <w:semiHidden/>
     <w:unhideWhenUsed/>
   </w:style>
   <w:style w:type="table" w:default="1" w:styleId="TableNormal">

</xml_diff>